<commit_message>
Modified the first file
</commit_message>
<xml_diff>
--- a/First.docx
+++ b/First.docx
@@ -12,10 +12,22 @@
         <w:rPr>
           <w:lang w:val="en-GB"/>
         </w:rPr>
-        <w:t>This is a GIT test file.</w:t>
+        <w:t>This is a</w:t>
+      </w:r>
+      <w:r>
+        <w:rPr>
+          <w:lang w:val="en-GB"/>
+        </w:rPr>
+        <w:t xml:space="preserve"> first</w:t>
       </w:r>
       <w:bookmarkStart w:id="0" w:name="_GoBack"/>
       <w:bookmarkEnd w:id="0"/>
+      <w:r>
+        <w:rPr>
+          <w:lang w:val="en-GB"/>
+        </w:rPr>
+        <w:t xml:space="preserve"> GIT test file.</w:t>
+      </w:r>
     </w:p>
     <w:sectPr>
       <w:pgSz w:w="12240" w:h="15840"/>

</xml_diff>